<commit_message>
sprzedaz: graficzne CTA smart-edu -> /prace/ i /sklep/, oferta po pobraniu wzoru, zestawy 79 zl, PDF-y z oferta per kierunek
- SmartEduCTA usuniety; navbar/hero/bottom/banery/sidebar prowadza do /prace/ i ebooka (PraceWzorcoweCTA)
- smart-edu zostaje w 2 linkach w tresci (narzedzia, antyplagiat) i 1 zdaniu w PDF-ach
- DownloadBox: blok po kliknieciu Pobierz (prace kierunku / ebook kierunkowy / ebook ogolny), zdarzenia GA4 upsell_view/upsell_click
- zestawy praca + przewodnik kierunkowy (scripts/zestawy.py, 23 produkty), opcja na stronie produktu
- ebook kierunkowy na /prace/<kierunek>/, baner prac na /tematy/logistyka/
- rozdzial metodologiczny: odnosnik do darmowego podgladu rozdzialu o metodologii (#podglad)
- sukces.astro: mapa produktow z products.json (prace szly do GA4 z wartoscia 0)
- wzory PDF: ostatnia strona z promo-kierunek.py, stopka -> /prace; build z --enable-installer (MiKTeX bez lm-math wisial)
</commit_message>
<xml_diff>
--- a/public/downloads/przykladowa-praca-magisterska-administracja.docx
+++ b/public/downloads/przykladowa-praca-magisterska-administracja.docx
@@ -136,7 +136,7 @@
         <w:t xml:space="preserve">(uchwały rad gmin, dokumenty urzędowe, dane o frekwencji). Takie połączenie jest znakiem rozpoznawczym dobrych prac z administracji — odróżnia je od prac czysto prawniczych. Niebieskie adnotacje opisują funkcję każdej części — usuń je w swojej pracy. Treść jest ilustracją: zweryfikuj aktualny stan prawny i dane. Pełne poradniki: praca-magisterska.pl/poradniki/</w:t>
       </w:r>
     </w:p>
-    <w:bookmarkStart w:id="20" w:name="streszczenie"/>
+    <w:bookmarkStart w:id="9" w:name="_streszczenie"/>
     <w:p>
       <w:pPr>
         <w:pStyle w:val="Heading1"/>
@@ -179,8 +179,8 @@
         <w:t xml:space="preserve">[Streszczenie pracy z administracji wskazuje przedmiot, cel, tezę, metody (tu: dwie!) i typ wniosków. Praca administracyjna często kończy się nie tylko wnioskami prawnymi, ale też rekomendacjami dla praktyki urzędów.]</w:t>
       </w:r>
     </w:p>
-    <w:bookmarkEnd w:id="20"/>
-    <w:bookmarkStart w:id="21" w:name="spis-treści"/>
+    <w:bookmarkEnd w:id="9"/>
+    <w:bookmarkStart w:id="10" w:name="_68349d0c7d64ae346c98bcec9a8185b5790f4f0"/>
     <w:p>
       <w:pPr>
         <w:pStyle w:val="Heading1"/>
@@ -376,8 +376,8 @@
         <w:t xml:space="preserve"> </w:t>
       </w:r>
     </w:p>
-    <w:bookmarkEnd w:id="21"/>
-    <w:bookmarkStart w:id="22" w:name="wstęp"/>
+    <w:bookmarkEnd w:id="10"/>
+    <w:bookmarkStart w:id="11" w:name="_wstęp"/>
     <w:p>
       <w:pPr>
         <w:pStyle w:val="Heading1"/>
@@ -396,10 +396,26 @@
     </w:p>
     <w:p>
       <w:pPr>
+        <w:pStyle w:val="FirstParagraph"/>
+      </w:pPr>
+      <w:r>
+        <w:t xml:space="preserve">Współczesna administracja publiczna coraz częściej sięga po instrumenty włączające mieszkańców w procesy decyzyjne. Budżet obywatelski, wywodzący się z brazylijskiego Porto Alegre, stał się w Polsce najbardziej rozpoznawalną formą partycypacji na poziomie lokalnym: mieszkańcy corocznie decydują w bezpośrednim głosowaniu o przeznaczeniu części wydatków gminy. Od nowelizacji ustrojowych ustaw samorządowych z 2018 roku budżet obywatelski ma umocowanie ustawowe, a w miastach na prawach powiatu jest obowiązkowy.</w:t>
+      </w:r>
+    </w:p>
+    <w:p>
+      <w:pPr>
+        <w:pStyle w:val="Anno"/>
+      </w:pPr>
+      <w:r>
+        <w:t xml:space="preserve">[Akapit 2 — przedmiot, cel i TEZA. W pracy z administracji, podobnie jak w prawniczej, stawia się tezę — ale można ją uzupełnić pytaniami badawczymi do części empirycznej.]</w:t>
+      </w:r>
+    </w:p>
+    <w:p>
+      <w:pPr>
         <w:pStyle w:val="BodyText"/>
       </w:pPr>
       <w:r>
-        <w:t xml:space="preserve">Współczesna administracja publiczna coraz częściej sięga po instrumenty włączające mieszkańców w procesy decyzyjne. Budżet obywatelski, wywodzący się z brazylijskiego Porto Alegre, stał się w Polsce najbardziej rozpoznawalną formą partycypacji na poziomie lokalnym: mieszkańcy corocznie decydują w bezpośrednim głosowaniu o przeznaczeniu części wydatków gminy. Od nowelizacji ustrojowych ustaw samorządowych z 2018 roku budżet obywatelski ma umocowanie ustawowe, a w miastach na prawach powiatu jest obowiązkowy.</w:t>
+        <w:t xml:space="preserve">Przedmiotem pracy jest instytucja budżetu obywatelskiego w ujęciu prawnym i praktycznym. Celem pracy jest ocena, w jakim stopniu regulacja art. 5a ustawy o samorządzie gminnym zapewnia mieszkańcom realny wpływ na wydatki gminy. W pracy postawiono tezę, że ustawa gwarantuje jedynie formalne ramy partycypacji, natomiast o jej rzeczywistej jakości rozstrzygają rozwiązania proceduralne przyjmowane w uchwałach rad gmin. Części empirycznej towarzyszą pytania badawcze: jak badane miasta ukształtowały procedury zgłaszania i weryfikacji projektów oraz jak kształtuje się frekwencja w głosowaniach.</w:t>
       </w:r>
     </w:p>
     <w:p>
@@ -407,7 +423,7 @@
         <w:pStyle w:val="Anno"/>
       </w:pPr>
       <w:r>
-        <w:t xml:space="preserve">[Akapit 2 — przedmiot, cel i TEZA. W pracy z administracji, podobnie jak w prawniczej, stawia się tezę — ale można ją uzupełnić pytaniami badawczymi do części empirycznej.]</w:t>
+        <w:t xml:space="preserve">[Akapit 3 — metody i struktura. Znak rozpoznawczy prac z administracji: połączenie metody dogmatyczno-prawnej z analizą dokumentów urzędowych lub danych o działaniu administracji.]</w:t>
       </w:r>
     </w:p>
     <w:p>
@@ -415,27 +431,11 @@
         <w:pStyle w:val="BodyText"/>
       </w:pPr>
       <w:r>
-        <w:t xml:space="preserve">Przedmiotem pracy jest instytucja budżetu obywatelskiego w ujęciu prawnym i praktycznym. Celem pracy jest ocena, w jakim stopniu regulacja art. 5a ustawy o samorządzie gminnym zapewnia mieszkańcom realny wpływ na wydatki gminy. W pracy postawiono tezę, że ustawa gwarantuje jedynie formalne ramy partycypacji, natomiast o jej rzeczywistej jakości rozstrzygają rozwiązania proceduralne przyjmowane w uchwałach rad gmin. Części empirycznej towarzyszą pytania badawcze: jak badane miasta ukształtowały procedury zgłaszania i weryfikacji projektów oraz jak kształtuje się frekwencja w głosowaniach.</w:t>
-      </w:r>
-    </w:p>
-    <w:p>
-      <w:pPr>
-        <w:pStyle w:val="Anno"/>
-      </w:pPr>
-      <w:r>
-        <w:t xml:space="preserve">[Akapit 3 — metody i struktura. Znak rozpoznawczy prac z administracji: połączenie metody dogmatyczno-prawnej z analizą dokumentów urzędowych lub danych o działaniu administracji.]</w:t>
-      </w:r>
-    </w:p>
-    <w:p>
-      <w:pPr>
-        <w:pStyle w:val="BodyText"/>
-      </w:pPr>
-      <w:r>
         <w:t xml:space="preserve">W pracy zastosowano dwie uzupełniające się metody. Rozdziały pierwszy i drugi opierają się na metodzie dogmatyczno-prawnej: analizie przepisów, poglądów doktryny i rozstrzygnięć nadzorczych. Rozdział trzeci wykorzystuje metodę analizy dokumentów urzędowych — uchwał rad miast, raportów ewaluacyjnych i danych o frekwencji publikowanych przez urzędy trzech celowo dobranych miast za lata 2022–2025.</w:t>
       </w:r>
     </w:p>
-    <w:bookmarkEnd w:id="22"/>
-    <w:bookmarkStart w:id="29" w:name="X833cb25d3878032e6fe07955f5240c0f6581fc7"/>
+    <w:bookmarkEnd w:id="11"/>
+    <w:bookmarkStart w:id="18" w:name="_833cb25d3878032e6fe07955f5240c0f6581fc7"/>
     <w:p>
       <w:pPr>
         <w:pStyle w:val="Heading1"/>
@@ -444,7 +444,7 @@
         <w:t xml:space="preserve">Rozdział 2. Budżet obywatelski w świetle obowiązującego prawa</w:t>
       </w:r>
     </w:p>
-    <w:bookmarkStart w:id="24" w:name="X4696d7c542a0331709b4da79439056fb984e4b1"/>
+    <w:bookmarkStart w:id="13" w:name="_4696d7c542a0331709b4da79439056fb984e4b1"/>
     <w:p>
       <w:pPr>
         <w:pStyle w:val="Heading2"/>
@@ -464,7 +464,7 @@
         <w:rPr>
           <w:rStyle w:val="FootnoteReference"/>
         </w:rPr>
-        <w:footnoteReference w:id="23"/>
+        <w:footnoteReference w:id="12"/>
       </w:r>
       <w:r>
         <w:t xml:space="preserve"> </w:t>
@@ -481,8 +481,8 @@
         <w:t xml:space="preserve">[Cytowanie aktu prawnego w przypisie: pełna nazwa, data, publikator. W tekście po pierwszym pełnym przywołaniu używaj skrótu (u.s.g.). Zwróć uwagę, że praca administracyjna cytuje też uchwały organów gminy — wzór w przypisie 3.]</w:t>
       </w:r>
     </w:p>
-    <w:bookmarkEnd w:id="24"/>
-    <w:bookmarkStart w:id="26" w:name="X8db29dd496caeffcb3700c619cd177cd52fd48d"/>
+    <w:bookmarkEnd w:id="13"/>
+    <w:bookmarkStart w:id="15" w:name="_8db29dd496caeffcb3700c619cd177cd52fd48d"/>
     <w:p>
       <w:pPr>
         <w:pStyle w:val="Heading2"/>
@@ -502,11 +502,11 @@
         <w:rPr>
           <w:rStyle w:val="FootnoteReference"/>
         </w:rPr>
-        <w:footnoteReference w:id="25"/>
-      </w:r>
-    </w:p>
-    <w:bookmarkEnd w:id="26"/>
-    <w:bookmarkStart w:id="28" w:name="X7a4cb5854913a6f9a2ce82a91ba957b8b2d637e"/>
+        <w:footnoteReference w:id="14"/>
+      </w:r>
+    </w:p>
+    <w:bookmarkEnd w:id="15"/>
+    <w:bookmarkStart w:id="17" w:name="_7a4cb5854913a6f9a2ce82a91ba957b8b2d637e"/>
     <w:p>
       <w:pPr>
         <w:pStyle w:val="Heading2"/>
@@ -526,7 +526,7 @@
         <w:rPr>
           <w:rStyle w:val="FootnoteReference"/>
         </w:rPr>
-        <w:footnoteReference w:id="27"/>
+        <w:footnoteReference w:id="16"/>
       </w:r>
     </w:p>
     <w:p>
@@ -537,9 +537,9 @@
         <w:t xml:space="preserve">[W rozdziale analitycznym prowadź wywód: przepis → doktryna → praktyka nadzorcza i orzecznicza → własna ocena. Rozstrzygnięcia nadzorcze wojewodów i wyroki WSA/NSA to materiał badawczy charakterystyczny dla administracji.]</w:t>
       </w:r>
     </w:p>
-    <w:bookmarkEnd w:id="28"/>
-    <w:bookmarkEnd w:id="29"/>
-    <w:bookmarkStart w:id="32" w:name="Xa6e88d4c5fd1aadca786933bef8dcadeeb87e62"/>
+    <w:bookmarkEnd w:id="17"/>
+    <w:bookmarkEnd w:id="18"/>
+    <w:bookmarkStart w:id="21" w:name="_a6e88d4c5fd1aadca786933bef8dcadeeb87e62"/>
     <w:p>
       <w:pPr>
         <w:pStyle w:val="Heading1"/>
@@ -548,7 +548,7 @@
         <w:t xml:space="preserve">Rozdział 3. Praktyka budżetu obywatelskiego w wybranych miastach</w:t>
       </w:r>
     </w:p>
-    <w:bookmarkStart w:id="30" w:name="Xb4f6e1e50246b5fd708095a53dec4cd28e70f2d"/>
+    <w:bookmarkStart w:id="19" w:name="_b4f6e1e50246b5fd708095a53dec4cd28e70f2d"/>
     <w:p>
       <w:pPr>
         <w:pStyle w:val="Heading2"/>
@@ -573,8 +573,8 @@
         <w:t xml:space="preserve">[Część empiryczna pracy z administracji NIE wymaga ankiety. Analiza dokumentów urzędowych — uchwał, regulaminów, sprawozdań, danych BIP — jest pełnoprawnym badaniem, o ile ma jawne kryteria doboru i porównania. Opisz materiał tak, żeby dało się badanie powtórzyć.]</w:t>
       </w:r>
     </w:p>
-    <w:bookmarkEnd w:id="30"/>
-    <w:bookmarkStart w:id="31" w:name="X93e75aa30e702498ef9814f3029049f618b6a33"/>
+    <w:bookmarkEnd w:id="19"/>
+    <w:bookmarkStart w:id="20" w:name="_93e75aa30e702498ef9814f3029049f618b6a33"/>
     <w:p>
       <w:pPr>
         <w:pStyle w:val="Heading2"/>
@@ -845,9 +845,9 @@
         <w:t xml:space="preserve">[Tabela porównawcza to najmocniejsze narzędzie tej części — pokazuje różnice na jeden rzut oka i daje podstawę do oceny w podrozdziale 3.4. Dane w tym wzorze są fikcyjne; w pracy podaj rzeczywiste, z przypisem do źródła (BIP, raport urzędu).]</w:t>
       </w:r>
     </w:p>
-    <w:bookmarkEnd w:id="31"/>
-    <w:bookmarkEnd w:id="32"/>
-    <w:bookmarkStart w:id="33" w:name="zakończenie-wnioski-i-rekomendacje"/>
+    <w:bookmarkEnd w:id="20"/>
+    <w:bookmarkEnd w:id="21"/>
+    <w:bookmarkStart w:id="22" w:name="_bc679b0cc1afc8e7e39b49b6d015378381049ef"/>
     <w:p>
       <w:pPr>
         <w:pStyle w:val="Heading1"/>
@@ -866,7 +866,7 @@
     </w:p>
     <w:p>
       <w:pPr>
-        <w:pStyle w:val="BodyText"/>
+        <w:pStyle w:val="FirstParagraph"/>
       </w:pPr>
       <w:r>
         <w:rPr>
@@ -918,8 +918,8 @@
         <w:t xml:space="preserve">Miastu C rekomenduje się wprowadzenie formalnej ścieżki odwoławczej oraz przywrócenie punktów głosowania papierowego, co w mieście B współwystępuje z najwyższą frekwencją w badanej grupie.</w:t>
       </w:r>
     </w:p>
-    <w:bookmarkEnd w:id="33"/>
-    <w:bookmarkStart w:id="34" w:name="wykaz-literatury"/>
+    <w:bookmarkEnd w:id="22"/>
+    <w:bookmarkStart w:id="23" w:name="_6901824936c780f676c83046b50b70faad2eb61"/>
     <w:p>
       <w:pPr>
         <w:pStyle w:val="Heading1"/>
@@ -1011,8 +1011,8 @@
         <w:t xml:space="preserve">, Warszawa 2014.</w:t>
       </w:r>
     </w:p>
-    <w:bookmarkEnd w:id="34"/>
-    <w:bookmarkStart w:id="35" w:name="wykaz-aktów-prawnych"/>
+    <w:bookmarkEnd w:id="23"/>
+    <w:bookmarkStart w:id="24" w:name="_86885980629b1312d43ebc87e94c7bd30d48420"/>
     <w:p>
       <w:pPr>
         <w:pStyle w:val="Heading1"/>
@@ -1045,8 +1045,8 @@
         <w:t xml:space="preserve">Ustawa z dnia 11 stycznia 2018 r. o zmianie niektórych ustaw w celu zwiększenia udziału obywateli w procesie wybierania, funkcjonowania i kontrolowania niektórych organów publicznych (Dz.U. poz. 130 z późn. zm.).</w:t>
       </w:r>
     </w:p>
-    <w:bookmarkEnd w:id="35"/>
-    <w:bookmarkStart w:id="39" w:name="wykaz-innych-źródeł"/>
+    <w:bookmarkEnd w:id="24"/>
+    <w:bookmarkStart w:id="31" w:name="_920570c10635bf2726b67365c477b028903bdc1"/>
     <w:p>
       <w:pPr>
         <w:pStyle w:val="Heading1"/>
@@ -1110,7 +1110,7 @@
     </w:p>
     <w:p>
       <w:pPr>
-        <w:pStyle w:val="BodyText"/>
+        <w:pStyle w:val="FirstParagraph"/>
       </w:pPr>
       <w:r>
         <w:t xml:space="preserve">Wzór przygotowała redakcja serwisu</w:t>
@@ -1138,7 +1138,7 @@
           <w:b/>
           <w:bCs/>
         </w:rPr>
-        <w:t xml:space="preserve">Smart-Edu.ai — pierwsza wersja pracy w kilka godzin, nie w kilka miesięcy</w:t>
+        <w:t xml:space="preserve">Ten wzór to szkielet. Tak wygląda praca napisana w całości.</w:t>
       </w:r>
     </w:p>
     <w:p>
@@ -1146,58 +1146,129 @@
         <w:pStyle w:val="Note"/>
       </w:pPr>
       <w:r>
-        <w:t xml:space="preserve">Podajesz temat, kierunek studiów i wytyczne promotora, a sztuczna inteligencja generuje unikalny, gotowy do edycji tekst: z poprawną strukturą rozdziałów, przypisami i bibliografią. Rejestracja jest darmowa, płacisz wyłącznie za wygenerowany tekst.</w:t>
-      </w:r>
-    </w:p>
-    <w:p>
-      <w:pPr>
-        <w:pStyle w:val="Note"/>
-      </w:pPr>
-      <w:hyperlink r:id="rId36">
+        <w:t xml:space="preserve">Kompletne prace magisterskie na konkretnych tematach, z przypisami wskazującymi numer strony w źródle i pełną bibliografią. 59 zł za pracę, PDF + Word, pobierasz od razu po płatności:</w:t>
+      </w:r>
+    </w:p>
+    <w:p>
+      <w:pPr>
+        <w:pStyle w:val="Compact"/>
+        <w:numPr>
+          <w:ilvl w:val="0"/>
+          <w:numId w:val="1004"/>
+        </w:numPr>
+      </w:pPr>
+      <w:hyperlink r:id="rId25">
+        <w:r>
+          <w:rPr>
+            <w:rStyle w:val="Hyperlink"/>
+          </w:rPr>
+          <w:t xml:space="preserve">Kompetencje wójta, burmistrza i prezydenta miasta jako organu wykonawczego gminy</w:t>
+        </w:r>
+      </w:hyperlink>
+      <w:r>
+        <w:t xml:space="preserve"> </w:t>
+      </w:r>
+      <w:r>
+        <w:t xml:space="preserve">— 64 strony, 82 przypisy</w:t>
+      </w:r>
+    </w:p>
+    <w:p>
+      <w:pPr>
+        <w:pStyle w:val="Compact"/>
+        <w:numPr>
+          <w:ilvl w:val="0"/>
+          <w:numId w:val="1004"/>
+        </w:numPr>
+      </w:pPr>
+      <w:hyperlink r:id="rId26">
+        <w:r>
+          <w:rPr>
+            <w:rStyle w:val="Hyperlink"/>
+          </w:rPr>
+          <w:t xml:space="preserve">Nadzór wojewody nad działalnością samorządu terytorialnego</w:t>
+        </w:r>
+      </w:hyperlink>
+      <w:r>
+        <w:t xml:space="preserve"> </w:t>
+      </w:r>
+      <w:r>
+        <w:t xml:space="preserve">— 68 stron, 204 przypisy</w:t>
+      </w:r>
+    </w:p>
+    <w:p>
+      <w:pPr>
+        <w:pStyle w:val="Compact"/>
+        <w:numPr>
+          <w:ilvl w:val="0"/>
+          <w:numId w:val="1004"/>
+        </w:numPr>
+      </w:pPr>
+      <w:hyperlink r:id="rId27">
+        <w:r>
+          <w:rPr>
+            <w:rStyle w:val="Hyperlink"/>
+          </w:rPr>
+          <w:t xml:space="preserve">Odpowiedzialność dyscyplinarna urzędników służby cywilnej</w:t>
+        </w:r>
+      </w:hyperlink>
+      <w:r>
+        <w:t xml:space="preserve"> </w:t>
+      </w:r>
+      <w:r>
+        <w:t xml:space="preserve">— 68 stron, 144 przypisy</w:t>
+      </w:r>
+    </w:p>
+    <w:p>
+      <w:pPr>
+        <w:pStyle w:val="BodyText"/>
+      </w:pPr>
+      <w:r>
+        <w:t xml:space="preserve">Wolisz napisać pracę samodzielnie? Przewodnik</w:t>
+      </w:r>
+      <w:r>
+        <w:t xml:space="preserve"> </w:t>
+      </w:r>
+      <w:hyperlink r:id="rId28">
         <w:r>
           <w:rPr>
             <w:rStyle w:val="Hyperlink"/>
             <w:b/>
             <w:bCs/>
           </w:rPr>
-          <w:t xml:space="preserve">www.smart-edu.ai/pl/masters-thesis</w:t>
+          <w:t xml:space="preserve">„Jak napisać pracę magisterską z administracji”</w:t>
         </w:r>
       </w:hyperlink>
+      <w:r>
+        <w:t xml:space="preserve"> </w:t>
+      </w:r>
+      <w:r>
+        <w:t xml:space="preserve">prowadzi przez dobór metody, narzędzia, analizę wyników i pisanie kolejnych rozdziałów (49 zł).</w:t>
+      </w:r>
     </w:p>
     <w:p>
       <w:pPr>
         <w:pStyle w:val="BodyText"/>
       </w:pPr>
       <w:r>
-        <w:t xml:space="preserve">Wolisz napisać pracę w pełni samodzielnie? Pomoże Ci ebook</w:t>
-      </w:r>
-      <w:r>
-        <w:t xml:space="preserve"> </w:t>
-      </w:r>
-      <w:r>
-        <w:rPr>
-          <w:b/>
-          <w:bCs/>
-        </w:rPr>
-        <w:t xml:space="preserve">„Jak napisać pracę magisterską. Kompletny przewodnik od A do Z”</w:t>
-      </w:r>
-      <w:r>
-        <w:t xml:space="preserve"> </w:t>
-      </w:r>
-      <w:r>
-        <w:t xml:space="preserve">— 250 stron praktycznych wskazówek, szablonów i checklist, z rozdziałem o etycznym korzystaniu z AI:</w:t>
-      </w:r>
-      <w:r>
-        <w:t xml:space="preserve"> </w:t>
-      </w:r>
-      <w:hyperlink r:id="rId37">
+        <w:t xml:space="preserve">Generator</w:t>
+      </w:r>
+      <w:r>
+        <w:t xml:space="preserve"> </w:t>
+      </w:r>
+      <w:hyperlink r:id="rId29">
         <w:r>
           <w:rPr>
             <w:rStyle w:val="Hyperlink"/>
           </w:rPr>
-          <w:t xml:space="preserve">www.praca-magisterska.pl/sklep/praca-magisterska-ebook/</w:t>
+          <w:t xml:space="preserve">Smart-Edu.ai</w:t>
         </w:r>
       </w:hyperlink>
+      <w:r>
+        <w:t xml:space="preserve"> </w:t>
+      </w:r>
+      <w:r>
+        <w:t xml:space="preserve">przygotuje pierwszą wersję tekstu z pomocą sztucznej inteligencji, jeśli wolisz zacząć od szkicu.</w:t>
+      </w:r>
     </w:p>
     <w:p>
       <w:pPr>
@@ -1213,7 +1284,7 @@
       <w:r>
         <w:t xml:space="preserve"> </w:t>
       </w:r>
-      <w:hyperlink r:id="rId38">
+      <w:hyperlink r:id="rId30">
         <w:r>
           <w:rPr>
             <w:rStyle w:val="Hyperlink"/>
@@ -1224,7 +1295,7 @@
         </w:r>
       </w:hyperlink>
     </w:p>
-    <w:bookmarkEnd w:id="39"/>
+    <w:bookmarkEnd w:id="31"/>
     <w:sectPr/>
   </w:body>
 </w:document>
@@ -1250,7 +1321,7 @@
       </w:r>
     </w:p>
   </w:footnote>
-  <w:footnote w:id="23">
+  <w:footnote w:id="12">
     <w:p>
       <w:pPr>
         <w:pStyle w:val="FootnoteText"/>
@@ -1269,7 +1340,7 @@
       </w:r>
     </w:p>
   </w:footnote>
-  <w:footnote w:id="25">
+  <w:footnote w:id="14">
     <w:p>
       <w:pPr>
         <w:pStyle w:val="FootnoteText"/>
@@ -1301,7 +1372,7 @@
       </w:r>
     </w:p>
   </w:footnote>
-  <w:footnote w:id="27">
+  <w:footnote w:id="16">
     <w:p>
       <w:pPr>
         <w:pStyle w:val="FootnoteText"/>
@@ -1484,6 +1555,109 @@
       <w:pPr>
         <w:ind w:left="6480" w:hanging="360"/>
       </w:pPr>
+    </w:lvl>
+  </w:abstractNum>
+  <w:abstractNum w:abstractNumId="991">
+    <w:nsid w:val="0000A991"/>
+    <w:multiLevelType w:val="multilevel"/>
+    <w:lvl w:ilvl="0">
+      <w:numFmt w:val="bullet"/>
+      <w:lvlText w:val=""/>
+      <w:lvlJc w:val="left"/>
+      <w:pPr>
+        <w:ind w:left="720" w:hanging="360"/>
+      </w:pPr>
+      <w:rPr>
+        <w:rFonts w:ascii="Symbol" w:hAnsi="Symbol" w:cs="Symbol" w:hint="default"/>
+      </w:rPr>
+    </w:lvl>
+    <w:lvl w:ilvl="1">
+      <w:numFmt w:val="bullet"/>
+      <w:lvlText w:val="o"/>
+      <w:lvlJc w:val="left"/>
+      <w:pPr>
+        <w:ind w:left="1440" w:hanging="360"/>
+      </w:pPr>
+      <w:rPr>
+        <w:rFonts w:ascii="Courier New" w:hAnsi="Courier New" w:cs="Courier New" w:hint="default"/>
+      </w:rPr>
+    </w:lvl>
+    <w:lvl w:ilvl="2">
+      <w:numFmt w:val="bullet"/>
+      <w:lvlText w:val=""/>
+      <w:lvlJc w:val="left"/>
+      <w:pPr>
+        <w:ind w:left="2160" w:hanging="360"/>
+      </w:pPr>
+      <w:rPr>
+        <w:rFonts w:ascii="Wingdings" w:hAnsi="Wingdings" w:cs="Wingdings" w:hint="default"/>
+      </w:rPr>
+    </w:lvl>
+    <w:lvl w:ilvl="3">
+      <w:numFmt w:val="bullet"/>
+      <w:lvlText w:val=""/>
+      <w:lvlJc w:val="left"/>
+      <w:pPr>
+        <w:ind w:left="2880" w:hanging="360"/>
+      </w:pPr>
+      <w:rPr>
+        <w:rFonts w:ascii="Symbol" w:hAnsi="Symbol" w:cs="Symbol" w:hint="default"/>
+      </w:rPr>
+    </w:lvl>
+    <w:lvl w:ilvl="4">
+      <w:numFmt w:val="bullet"/>
+      <w:lvlText w:val="o"/>
+      <w:lvlJc w:val="left"/>
+      <w:pPr>
+        <w:ind w:left="3600" w:hanging="360"/>
+      </w:pPr>
+      <w:rPr>
+        <w:rFonts w:ascii="Courier New" w:hAnsi="Courier New" w:cs="Courier New" w:hint="default"/>
+      </w:rPr>
+    </w:lvl>
+    <w:lvl w:ilvl="5">
+      <w:numFmt w:val="bullet"/>
+      <w:lvlText w:val=""/>
+      <w:lvlJc w:val="left"/>
+      <w:pPr>
+        <w:ind w:left="4320" w:hanging="360"/>
+      </w:pPr>
+      <w:rPr>
+        <w:rFonts w:ascii="Wingdings" w:hAnsi="Wingdings" w:cs="Wingdings" w:hint="default"/>
+      </w:rPr>
+    </w:lvl>
+    <w:lvl w:ilvl="6">
+      <w:numFmt w:val="bullet"/>
+      <w:lvlText w:val=""/>
+      <w:lvlJc w:val="left"/>
+      <w:pPr>
+        <w:ind w:left="5040" w:hanging="360"/>
+      </w:pPr>
+      <w:rPr>
+        <w:rFonts w:ascii="Symbol" w:hAnsi="Symbol" w:cs="Symbol" w:hint="default"/>
+      </w:rPr>
+    </w:lvl>
+    <w:lvl w:ilvl="7">
+      <w:numFmt w:val="bullet"/>
+      <w:lvlText w:val="o"/>
+      <w:lvlJc w:val="left"/>
+      <w:pPr>
+        <w:ind w:left="5760" w:hanging="360"/>
+      </w:pPr>
+      <w:rPr>
+        <w:rFonts w:ascii="Courier New" w:hAnsi="Courier New" w:cs="Courier New" w:hint="default"/>
+      </w:rPr>
+    </w:lvl>
+    <w:lvl w:ilvl="8">
+      <w:numFmt w:val="bullet"/>
+      <w:lvlText w:val=""/>
+      <w:lvlJc w:val="left"/>
+      <w:pPr>
+        <w:ind w:left="6480" w:hanging="360"/>
+      </w:pPr>
+      <w:rPr>
+        <w:rFonts w:ascii="Wingdings" w:hAnsi="Wingdings" w:cs="Wingdings" w:hint="default"/>
+      </w:rPr>
     </w:lvl>
   </w:abstractNum>
   <w:num w:numId="1000">
@@ -1578,6 +1752,9 @@
     <w:lvlOverride w:ilvl="8">
       <w:startOverride w:val="1"/>
     </w:lvlOverride>
+  </w:num>
+  <w:num w:numId="1004">
+    <w:abstractNumId w:val="991"/>
   </w:num>
 </w:numbering>
 </file>

</xml_diff>